<commit_message>
Deploying to gh-pages from @ Morrison-Lab/psw@58682713b5bf6329395178666050086045c901ef 🚀
</commit_message>
<xml_diff>
--- a/chapters/avoid-ai-tells.docx
+++ b/chapters/avoid-ai-tells.docx
@@ -15,7 +15,7 @@
         <w:pStyle w:val="Date"/>
       </w:pPr>
       <w:r>
-        <w:t xml:space="preserve">Last modified: 2026-09-10 21:55:51 (UTC)</w:t>
+        <w:t xml:space="preserve">Last modified: 2026-09-26 05:55:30 (UTC)</w:t>
       </w:r>
     </w:p>
     <w:tbl>
@@ -383,12 +383,13 @@
           <w:tbl>
             <w:tblPr>
               <w:tblStyle w:val="Table"/>
-              <w:tblW w:type="auto" w:w="0"/>
+              <w:tblW w:type="pct" w:w="5000"/>
+              <w:tblLayout w:type="fixed"/>
               <w:tblLook w:firstRow="1" w:lastRow="0" w:firstColumn="0" w:lastColumn="0" w:noHBand="0" w:noVBand="0" w:val="0020"/>
             </w:tblPr>
             <w:tblGrid>
-              <w:gridCol w:w="3960"/>
-              <w:gridCol w:w="3960"/>
+              <w:gridCol w:w="2346"/>
+              <w:gridCol w:w="5573"/>
             </w:tblGrid>
             <w:tr>
               <w:trPr>
@@ -623,6 +624,526 @@
                   </w:pPr>
                   <w:r>
                     <w:t xml:space="preserve">shows, demonstrates</w:t>
+                  </w:r>
+                </w:p>
+              </w:tc>
+            </w:tr>
+            <w:tr>
+              <w:tc>
+                <w:tcPr/>
+                <w:p>
+                  <w:pPr>
+                    <w:pStyle w:val="Compact"/>
+                    <w:jc w:val="center"/>
+                  </w:pPr>
+                  <w:r>
+                    <w:t xml:space="preserve">tapestry, landscape, realm</w:t>
+                  </w:r>
+                </w:p>
+              </w:tc>
+              <w:tc>
+                <w:tcPr/>
+                <w:p>
+                  <w:pPr>
+                    <w:pStyle w:val="Compact"/>
+                    <w:jc w:val="center"/>
+                  </w:pPr>
+                  <w:r>
+                    <w:t xml:space="preserve">field, area, or name the thing</w:t>
+                  </w:r>
+                </w:p>
+              </w:tc>
+            </w:tr>
+            <w:tr>
+              <w:tc>
+                <w:tcPr/>
+                <w:p>
+                  <w:pPr>
+                    <w:pStyle w:val="Compact"/>
+                    <w:jc w:val="center"/>
+                  </w:pPr>
+                  <w:r>
+                    <w:t xml:space="preserve">navigate</w:t>
+                  </w:r>
+                </w:p>
+              </w:tc>
+              <w:tc>
+                <w:tcPr/>
+                <w:p>
+                  <w:pPr>
+                    <w:pStyle w:val="Compact"/>
+                    <w:jc w:val="center"/>
+                  </w:pPr>
+                  <w:r>
+                    <w:t xml:space="preserve">handle, work through</w:t>
+                  </w:r>
+                </w:p>
+              </w:tc>
+            </w:tr>
+            <w:tr>
+              <w:tc>
+                <w:tcPr/>
+                <w:p>
+                  <w:pPr>
+                    <w:pStyle w:val="Compact"/>
+                    <w:jc w:val="center"/>
+                  </w:pPr>
+                  <w:r>
+                    <w:t xml:space="preserve">underscore, highlight</w:t>
+                  </w:r>
+                </w:p>
+              </w:tc>
+              <w:tc>
+                <w:tcPr/>
+                <w:p>
+                  <w:pPr>
+                    <w:pStyle w:val="Compact"/>
+                    <w:jc w:val="center"/>
+                  </w:pPr>
+                  <w:r>
+                    <w:t xml:space="preserve">show</w:t>
+                  </w:r>
+                </w:p>
+              </w:tc>
+            </w:tr>
+            <w:tr>
+              <w:tc>
+                <w:tcPr/>
+                <w:p>
+                  <w:pPr>
+                    <w:pStyle w:val="Compact"/>
+                    <w:jc w:val="center"/>
+                  </w:pPr>
+                  <w:r>
+                    <w:t xml:space="preserve">foster, bolster</w:t>
+                  </w:r>
+                </w:p>
+              </w:tc>
+              <w:tc>
+                <w:tcPr/>
+                <w:p>
+                  <w:pPr>
+                    <w:pStyle w:val="Compact"/>
+                    <w:jc w:val="center"/>
+                  </w:pPr>
+                  <w:r>
+                    <w:t xml:space="preserve">encourage, strengthen</w:t>
+                  </w:r>
+                </w:p>
+              </w:tc>
+            </w:tr>
+            <w:tr>
+              <w:tc>
+                <w:tcPr/>
+                <w:p>
+                  <w:pPr>
+                    <w:pStyle w:val="Compact"/>
+                    <w:jc w:val="center"/>
+                  </w:pPr>
+                  <w:r>
+                    <w:t xml:space="preserve">intricate, meticulous</w:t>
+                  </w:r>
+                </w:p>
+              </w:tc>
+              <w:tc>
+                <w:tcPr/>
+                <w:p>
+                  <w:pPr>
+                    <w:pStyle w:val="Compact"/>
+                    <w:jc w:val="center"/>
+                  </w:pPr>
+                  <w:r>
+                    <w:t xml:space="preserve">detailed, careful</w:t>
+                  </w:r>
+                </w:p>
+              </w:tc>
+            </w:tr>
+            <w:tr>
+              <w:tc>
+                <w:tcPr/>
+                <w:p>
+                  <w:pPr>
+                    <w:pStyle w:val="Compact"/>
+                    <w:jc w:val="center"/>
+                  </w:pPr>
+                  <w:r>
+                    <w:t xml:space="preserve">comprehensive</w:t>
+                  </w:r>
+                </w:p>
+              </w:tc>
+              <w:tc>
+                <w:tcPr/>
+                <w:p>
+                  <w:pPr>
+                    <w:pStyle w:val="Compact"/>
+                    <w:jc w:val="center"/>
+                  </w:pPr>
+                  <w:r>
+                    <w:t xml:space="preserve">complete, or say what it covers</w:t>
+                  </w:r>
+                </w:p>
+              </w:tc>
+            </w:tr>
+            <w:tr>
+              <w:tc>
+                <w:tcPr/>
+                <w:p>
+                  <w:pPr>
+                    <w:pStyle w:val="Compact"/>
+                    <w:jc w:val="center"/>
+                  </w:pPr>
+                  <w:r>
+                    <w:t xml:space="preserve">groundbreaking</w:t>
+                  </w:r>
+                </w:p>
+              </w:tc>
+              <w:tc>
+                <w:tcPr/>
+                <w:p>
+                  <w:pPr>
+                    <w:pStyle w:val="Compact"/>
+                    <w:jc w:val="center"/>
+                  </w:pPr>
+                  <w:r>
+                    <w:t xml:space="preserve">new, or say what changed</w:t>
+                  </w:r>
+                </w:p>
+              </w:tc>
+            </w:tr>
+            <w:tr>
+              <w:tc>
+                <w:tcPr/>
+                <w:p>
+                  <w:pPr>
+                    <w:pStyle w:val="Compact"/>
+                    <w:jc w:val="center"/>
+                  </w:pPr>
+                  <w:r>
+                    <w:t xml:space="preserve">unlock, harness, empower</w:t>
+                  </w:r>
+                </w:p>
+              </w:tc>
+              <w:tc>
+                <w:tcPr/>
+                <w:p>
+                  <w:pPr>
+                    <w:pStyle w:val="Compact"/>
+                    <w:jc w:val="center"/>
+                  </w:pPr>
+                  <w:r>
+                    <w:t xml:space="preserve">enable, use, allow</w:t>
+                  </w:r>
+                </w:p>
+              </w:tc>
+            </w:tr>
+            <w:tr>
+              <w:tc>
+                <w:tcPr/>
+                <w:p>
+                  <w:pPr>
+                    <w:pStyle w:val="Compact"/>
+                    <w:jc w:val="center"/>
+                  </w:pPr>
+                  <w:r>
+                    <w:t xml:space="preserve">myriad, plethora</w:t>
+                  </w:r>
+                </w:p>
+              </w:tc>
+              <w:tc>
+                <w:tcPr/>
+                <w:p>
+                  <w:pPr>
+                    <w:pStyle w:val="Compact"/>
+                    <w:jc w:val="center"/>
+                  </w:pPr>
+                  <w:r>
+                    <w:t xml:space="preserve">many, or give the count</w:t>
+                  </w:r>
+                </w:p>
+              </w:tc>
+            </w:tr>
+            <w:tr>
+              <w:tc>
+                <w:tcPr/>
+                <w:p>
+                  <w:pPr>
+                    <w:pStyle w:val="Compact"/>
+                    <w:jc w:val="center"/>
+                  </w:pPr>
+                  <w:r>
+                    <w:t xml:space="preserve">seamless, seamlessly</w:t>
+                  </w:r>
+                </w:p>
+              </w:tc>
+              <w:tc>
+                <w:tcPr/>
+                <w:p>
+                  <w:pPr>
+                    <w:pStyle w:val="Compact"/>
+                    <w:jc w:val="center"/>
+                  </w:pPr>
+                  <w:r>
+                    <w:t xml:space="preserve">smoothly, or say what does not break</w:t>
+                  </w:r>
+                </w:p>
+              </w:tc>
+            </w:tr>
+            <w:tr>
+              <w:tc>
+                <w:tcPr/>
+                <w:p>
+                  <w:pPr>
+                    <w:pStyle w:val="Compact"/>
+                    <w:jc w:val="center"/>
+                  </w:pPr>
+                  <w:r>
+                    <w:t xml:space="preserve">holistic, multifaceted, nuanced</w:t>
+                  </w:r>
+                </w:p>
+              </w:tc>
+              <w:tc>
+                <w:tcPr/>
+                <w:p>
+                  <w:pPr>
+                    <w:pStyle w:val="Compact"/>
+                    <w:jc w:val="center"/>
+                  </w:pPr>
+                  <w:r>
+                    <w:t xml:space="preserve">say which parts or distinctions</w:t>
+                  </w:r>
+                </w:p>
+              </w:tc>
+            </w:tr>
+            <w:tr>
+              <w:tc>
+                <w:tcPr/>
+                <w:p>
+                  <w:pPr>
+                    <w:pStyle w:val="Compact"/>
+                    <w:jc w:val="center"/>
+                  </w:pPr>
+                  <w:r>
+                    <w:t xml:space="preserve">paramount</w:t>
+                  </w:r>
+                </w:p>
+              </w:tc>
+              <w:tc>
+                <w:tcPr/>
+                <w:p>
+                  <w:pPr>
+                    <w:pStyle w:val="Compact"/>
+                    <w:jc w:val="center"/>
+                  </w:pPr>
+                  <w:r>
+                    <w:t xml:space="preserve">most important</w:t>
+                  </w:r>
+                </w:p>
+              </w:tc>
+            </w:tr>
+            <w:tr>
+              <w:tc>
+                <w:tcPr/>
+                <w:p>
+                  <w:pPr>
+                    <w:pStyle w:val="Compact"/>
+                    <w:jc w:val="center"/>
+                  </w:pPr>
+                  <w:r>
+                    <w:t xml:space="preserve">embark, elevate</w:t>
+                  </w:r>
+                </w:p>
+              </w:tc>
+              <w:tc>
+                <w:tcPr/>
+                <w:p>
+                  <w:pPr>
+                    <w:pStyle w:val="Compact"/>
+                    <w:jc w:val="center"/>
+                  </w:pPr>
+                  <w:r>
+                    <w:t xml:space="preserve">start, improve</w:t>
+                  </w:r>
+                </w:p>
+              </w:tc>
+            </w:tr>
+            <w:tr>
+              <w:tc>
+                <w:tcPr/>
+                <w:p>
+                  <w:pPr>
+                    <w:pStyle w:val="Compact"/>
+                    <w:jc w:val="center"/>
+                  </w:pPr>
+                  <w:r>
+                    <w:t xml:space="preserve">streamline</w:t>
+                  </w:r>
+                </w:p>
+              </w:tc>
+              <w:tc>
+                <w:tcPr/>
+                <w:p>
+                  <w:pPr>
+                    <w:pStyle w:val="Compact"/>
+                    <w:jc w:val="center"/>
+                  </w:pPr>
+                  <w:r>
+                    <w:t xml:space="preserve">simplify, speed up</w:t>
+                  </w:r>
+                </w:p>
+              </w:tc>
+            </w:tr>
+            <w:tr>
+              <w:tc>
+                <w:tcPr/>
+                <w:p>
+                  <w:pPr>
+                    <w:pStyle w:val="Compact"/>
+                    <w:jc w:val="center"/>
+                  </w:pPr>
+                  <w:r>
+                    <w:t xml:space="preserve">synergy</w:t>
+                  </w:r>
+                </w:p>
+              </w:tc>
+              <w:tc>
+                <w:tcPr/>
+                <w:p>
+                  <w:pPr>
+                    <w:pStyle w:val="Compact"/>
+                    <w:jc w:val="center"/>
+                  </w:pPr>
+                  <w:r>
+                    <w:t xml:space="preserve">say what the combination does</w:t>
+                  </w:r>
+                </w:p>
+              </w:tc>
+            </w:tr>
+            <w:tr>
+              <w:tc>
+                <w:tcPr/>
+                <w:p>
+                  <w:pPr>
+                    <w:pStyle w:val="Compact"/>
+                    <w:jc w:val="center"/>
+                  </w:pPr>
+                  <w:r>
+                    <w:t xml:space="preserve">actionable</w:t>
+                  </w:r>
+                </w:p>
+              </w:tc>
+              <w:tc>
+                <w:tcPr/>
+                <w:p>
+                  <w:pPr>
+                    <w:pStyle w:val="Compact"/>
+                    <w:jc w:val="center"/>
+                  </w:pPr>
+                  <w:r>
+                    <w:t xml:space="preserve">say what action it supports</w:t>
+                  </w:r>
+                </w:p>
+              </w:tc>
+            </w:tr>
+            <w:tr>
+              <w:tc>
+                <w:tcPr/>
+                <w:p>
+                  <w:pPr>
+                    <w:pStyle w:val="Compact"/>
+                    <w:jc w:val="center"/>
+                  </w:pPr>
+                  <w:r>
+                    <w:t xml:space="preserve">beacon</w:t>
+                  </w:r>
+                </w:p>
+              </w:tc>
+              <w:tc>
+                <w:tcPr/>
+                <w:p>
+                  <w:pPr>
+                    <w:pStyle w:val="Compact"/>
+                    <w:jc w:val="center"/>
+                  </w:pPr>
+                  <w:r>
+                    <w:t xml:space="preserve">example, model</w:t>
+                  </w:r>
+                </w:p>
+              </w:tc>
+            </w:tr>
+            <w:tr>
+              <w:tc>
+                <w:tcPr/>
+                <w:p>
+                  <w:pPr>
+                    <w:pStyle w:val="Compact"/>
+                    <w:jc w:val="center"/>
+                  </w:pPr>
+                  <w:r>
+                    <w:t xml:space="preserve">game-changer, gamechanger, state-of-the-art, cutting-edge</w:t>
+                  </w:r>
+                </w:p>
+              </w:tc>
+              <w:tc>
+                <w:tcPr/>
+                <w:p>
+                  <w:pPr>
+                    <w:pStyle w:val="Compact"/>
+                    <w:jc w:val="center"/>
+                  </w:pPr>
+                  <w:r>
+                    <w:t xml:space="preserve">say what changed and by how much</w:t>
+                  </w:r>
+                </w:p>
+              </w:tc>
+            </w:tr>
+            <w:tr>
+              <w:tc>
+                <w:tcPr/>
+                <w:p>
+                  <w:pPr>
+                    <w:pStyle w:val="Compact"/>
+                    <w:jc w:val="center"/>
+                  </w:pPr>
+                  <w:r>
+                    <w:t xml:space="preserve">ever-evolving</w:t>
+                  </w:r>
+                </w:p>
+              </w:tc>
+              <w:tc>
+                <w:tcPr/>
+                <w:p>
+                  <w:pPr>
+                    <w:pStyle w:val="Compact"/>
+                    <w:jc w:val="center"/>
+                  </w:pPr>
+                  <w:r>
+                    <w:t xml:space="preserve">changing</w:t>
+                  </w:r>
+                </w:p>
+              </w:tc>
+            </w:tr>
+            <w:tr>
+              <w:tc>
+                <w:tcPr/>
+                <w:p>
+                  <w:pPr>
+                    <w:pStyle w:val="Compact"/>
+                    <w:jc w:val="center"/>
+                  </w:pPr>
+                  <w:r>
+                    <w:t xml:space="preserve">treasure trove</w:t>
+                  </w:r>
+                </w:p>
+              </w:tc>
+              <w:tc>
+                <w:tcPr/>
+                <w:p>
+                  <w:pPr>
+                    <w:pStyle w:val="Compact"/>
+                    <w:jc w:val="center"/>
+                  </w:pPr>
+                  <w:r>
+                    <w:t xml:space="preserve">collection, source</w:t>
                   </w:r>
                 </w:p>
               </w:tc>
@@ -682,6 +1203,221 @@
       <w:r>
         <w:t xml:space="preserve">delete them and start with the actual point.</w:t>
       </w:r>
+      <w:r>
+        <w:t xml:space="preserve"> </w:t>
+      </w:r>
+      <w:r>
+        <w:t xml:space="preserve">Two more families recur, and each member should give way to the literal claim:</w:t>
+      </w:r>
+    </w:p>
+    <w:p>
+      <w:pPr>
+        <w:pStyle w:val="Compact"/>
+        <w:numPr>
+          <w:ilvl w:val="0"/>
+          <w:numId w:val="1001"/>
+        </w:numPr>
+      </w:pPr>
+      <w:r>
+        <w:rPr>
+          <w:b/>
+          <w:bCs/>
+        </w:rPr>
+        <w:t xml:space="preserve">Stock metaphors:</w:t>
+      </w:r>
+    </w:p>
+    <w:p>
+      <w:pPr>
+        <w:pStyle w:val="Compact"/>
+        <w:numPr>
+          <w:ilvl w:val="1"/>
+          <w:numId w:val="1002"/>
+        </w:numPr>
+      </w:pPr>
+      <w:r>
+        <w:t xml:space="preserve">“journey”</w:t>
+      </w:r>
+    </w:p>
+    <w:p>
+      <w:pPr>
+        <w:pStyle w:val="Compact"/>
+        <w:numPr>
+          <w:ilvl w:val="1"/>
+          <w:numId w:val="1002"/>
+        </w:numPr>
+      </w:pPr>
+      <w:r>
+        <w:t xml:space="preserve">“pave the way”</w:t>
+      </w:r>
+    </w:p>
+    <w:p>
+      <w:pPr>
+        <w:pStyle w:val="Compact"/>
+        <w:numPr>
+          <w:ilvl w:val="1"/>
+          <w:numId w:val="1002"/>
+        </w:numPr>
+      </w:pPr>
+      <w:r>
+        <w:t xml:space="preserve">“shed light on”</w:t>
+      </w:r>
+    </w:p>
+    <w:p>
+      <w:pPr>
+        <w:pStyle w:val="Compact"/>
+        <w:numPr>
+          <w:ilvl w:val="1"/>
+          <w:numId w:val="1002"/>
+        </w:numPr>
+      </w:pPr>
+      <w:r>
+        <w:t xml:space="preserve">“at the heart of”</w:t>
+      </w:r>
+    </w:p>
+    <w:p>
+      <w:pPr>
+        <w:pStyle w:val="Compact"/>
+        <w:numPr>
+          <w:ilvl w:val="1"/>
+          <w:numId w:val="1002"/>
+        </w:numPr>
+      </w:pPr>
+      <w:r>
+        <w:t xml:space="preserve">“sits at the intersection of”</w:t>
+      </w:r>
+    </w:p>
+    <w:p>
+      <w:pPr>
+        <w:pStyle w:val="Compact"/>
+        <w:numPr>
+          <w:ilvl w:val="1"/>
+          <w:numId w:val="1002"/>
+        </w:numPr>
+      </w:pPr>
+      <w:r>
+        <w:t xml:space="preserve">“cornerstone”</w:t>
+      </w:r>
+    </w:p>
+    <w:p>
+      <w:pPr>
+        <w:pStyle w:val="Compact"/>
+        <w:numPr>
+          <w:ilvl w:val="1"/>
+          <w:numId w:val="1002"/>
+        </w:numPr>
+      </w:pPr>
+      <w:r>
+        <w:t xml:space="preserve">“deep dive”</w:t>
+      </w:r>
+      <w:r>
+        <w:t xml:space="preserve">,</w:t>
+      </w:r>
+      <w:r>
+        <w:t xml:space="preserve"> </w:t>
+      </w:r>
+      <w:r>
+        <w:t xml:space="preserve">“dive into”</w:t>
+      </w:r>
+    </w:p>
+    <w:p>
+      <w:pPr>
+        <w:pStyle w:val="Compact"/>
+        <w:numPr>
+          <w:ilvl w:val="0"/>
+          <w:numId w:val="1001"/>
+        </w:numPr>
+      </w:pPr>
+      <w:r>
+        <w:rPr>
+          <w:b/>
+          <w:bCs/>
+        </w:rPr>
+        <w:t xml:space="preserve">Stock framings:</w:t>
+      </w:r>
+    </w:p>
+    <w:p>
+      <w:pPr>
+        <w:pStyle w:val="Compact"/>
+        <w:numPr>
+          <w:ilvl w:val="1"/>
+          <w:numId w:val="1003"/>
+        </w:numPr>
+      </w:pPr>
+      <w:r>
+        <w:t xml:space="preserve">“at its core”</w:t>
+      </w:r>
+    </w:p>
+    <w:p>
+      <w:pPr>
+        <w:pStyle w:val="Compact"/>
+        <w:numPr>
+          <w:ilvl w:val="1"/>
+          <w:numId w:val="1003"/>
+        </w:numPr>
+      </w:pPr>
+      <w:r>
+        <w:t xml:space="preserve">“in essence”</w:t>
+      </w:r>
+    </w:p>
+    <w:p>
+      <w:pPr>
+        <w:pStyle w:val="Compact"/>
+        <w:numPr>
+          <w:ilvl w:val="1"/>
+          <w:numId w:val="1003"/>
+        </w:numPr>
+      </w:pPr>
+      <w:r>
+        <w:t xml:space="preserve">“boils down to”</w:t>
+      </w:r>
+    </w:p>
+    <w:p>
+      <w:pPr>
+        <w:pStyle w:val="Compact"/>
+        <w:numPr>
+          <w:ilvl w:val="1"/>
+          <w:numId w:val="1003"/>
+        </w:numPr>
+      </w:pPr>
+      <w:r>
+        <w:t xml:space="preserve">“when it comes to”</w:t>
+      </w:r>
+    </w:p>
+    <w:p>
+      <w:pPr>
+        <w:pStyle w:val="Compact"/>
+        <w:numPr>
+          <w:ilvl w:val="1"/>
+          <w:numId w:val="1003"/>
+        </w:numPr>
+      </w:pPr>
+      <w:r>
+        <w:t xml:space="preserve">“in the realm of”</w:t>
+      </w:r>
+    </w:p>
+    <w:p>
+      <w:pPr>
+        <w:pStyle w:val="Compact"/>
+        <w:numPr>
+          <w:ilvl w:val="1"/>
+          <w:numId w:val="1003"/>
+        </w:numPr>
+      </w:pPr>
+      <w:r>
+        <w:t xml:space="preserve">“the key takeaway”</w:t>
+      </w:r>
+    </w:p>
+    <w:p>
+      <w:pPr>
+        <w:pStyle w:val="Compact"/>
+        <w:numPr>
+          <w:ilvl w:val="1"/>
+          <w:numId w:val="1003"/>
+        </w:numPr>
+      </w:pPr>
+      <w:r>
+        <w:t xml:space="preserve">“more than just”</w:t>
+      </w:r>
     </w:p>
     <w:bookmarkEnd w:id="14"/>
     <w:bookmarkStart w:id="16" w:name="rhetorical-reflexes"/>
@@ -828,7 +1564,7 @@
         <w:pStyle w:val="Compact"/>
         <w:numPr>
           <w:ilvl w:val="0"/>
-          <w:numId w:val="1001"/>
+          <w:numId w:val="1004"/>
         </w:numPr>
       </w:pPr>
       <w:r>
@@ -856,7 +1592,7 @@
         <w:pStyle w:val="Compact"/>
         <w:numPr>
           <w:ilvl w:val="0"/>
-          <w:numId w:val="1001"/>
+          <w:numId w:val="1004"/>
         </w:numPr>
       </w:pPr>
       <w:r>
@@ -902,7 +1638,7 @@
         <w:pStyle w:val="Compact"/>
         <w:numPr>
           <w:ilvl w:val="0"/>
-          <w:numId w:val="1001"/>
+          <w:numId w:val="1004"/>
         </w:numPr>
       </w:pPr>
       <w:r>
@@ -942,7 +1678,7 @@
         <w:pStyle w:val="Compact"/>
         <w:numPr>
           <w:ilvl w:val="0"/>
-          <w:numId w:val="1001"/>
+          <w:numId w:val="1004"/>
         </w:numPr>
       </w:pPr>
       <w:r>
@@ -978,13 +1714,13 @@
       </w:r>
     </w:p>
     <w:bookmarkEnd w:id="16"/>
-    <w:bookmarkStart w:id="17" w:name="formatting-habits"/>
+    <w:bookmarkStart w:id="22" w:name="clichéd-sentence-shapes"/>
     <w:p>
       <w:pPr>
         <w:pStyle w:val="Heading2"/>
       </w:pPr>
       <w:r>
-        <w:t xml:space="preserve">3 Formatting habits</w:t>
+        <w:t xml:space="preserve">3 Clichéd sentence shapes</w:t>
       </w:r>
     </w:p>
     <w:p>
@@ -992,6 +1728,1232 @@
         <w:pStyle w:val="FirstParagraph"/>
       </w:pPr>
       <w:r>
+        <w:t xml:space="preserve">Beyond the antithesis,</w:t>
+      </w:r>
+      <w:r>
+        <w:t xml:space="preserve"> </w:t>
+      </w:r>
+      <w:r>
+        <w:t xml:space="preserve">AI drafts lean on a set of sentence shapes</w:t>
+      </w:r>
+      <w:r>
+        <w:t xml:space="preserve"> </w:t>
+      </w:r>
+      <w:r>
+        <w:t xml:space="preserve">that stage a point instead of stating it.</w:t>
+      </w:r>
+    </w:p>
+    <w:bookmarkStart w:id="17" w:name="exm-staged-point"/>
+    <w:p>
+      <w:pPr>
+        <w:pStyle w:val="BodyText"/>
+      </w:pPr>
+      <w:r>
+        <w:rPr>
+          <w:b/>
+          <w:bCs/>
+        </w:rPr>
+        <w:t xml:space="preserve">Example 2 (A staged point)</w:t>
+      </w:r>
+      <w:r>
+        <w:t xml:space="preserve"> </w:t>
+      </w:r>
+      <w:r>
+        <w:t xml:space="preserve"> </w:t>
+      </w:r>
+    </w:p>
+    <w:p>
+      <w:pPr>
+        <w:pStyle w:val="BlockText"/>
+      </w:pPr>
+      <w:r>
+        <w:t xml:space="preserve">❌ It can read like a definition that says nothing.</w:t>
+      </w:r>
+      <w:r>
+        <w:t xml:space="preserve"> </w:t>
+      </w:r>
+      <w:r>
+        <w:t xml:space="preserve">Its use is in what it forces you to name:</w:t>
+      </w:r>
+      <w:r>
+        <w:t xml:space="preserve"> </w:t>
+      </w:r>
+      <w:r>
+        <w:t xml:space="preserve">a project that cannot say what its</w:t>
+      </w:r>
+      <w:r>
+        <w:t xml:space="preserve"> </w:t>
+      </w:r>
+      <m:oMath>
+        <m:r>
+          <m:t>E</m:t>
+        </m:r>
+      </m:oMath>
+      <w:r>
+        <w:t xml:space="preserve">,</w:t>
+      </w:r>
+      <w:r>
+        <w:t xml:space="preserve"> </w:t>
+      </w:r>
+      <m:oMath>
+        <m:r>
+          <m:t>T</m:t>
+        </m:r>
+      </m:oMath>
+      <w:r>
+        <w:t xml:space="preserve"> </w:t>
+      </w:r>
+      <w:r>
+        <w:t xml:space="preserve">and</w:t>
+      </w:r>
+      <w:r>
+        <w:t xml:space="preserve"> </w:t>
+      </w:r>
+      <m:oMath>
+        <m:r>
+          <m:t>P</m:t>
+        </m:r>
+      </m:oMath>
+      <w:r>
+        <w:t xml:space="preserve"> </w:t>
+      </w:r>
+      <w:r>
+        <w:t xml:space="preserve">are</w:t>
+      </w:r>
+      <w:r>
+        <w:t xml:space="preserve"> </w:t>
+      </w:r>
+      <w:r>
+        <w:t xml:space="preserve">has not yet stated a machine learning problem.</w:t>
+      </w:r>
+    </w:p>
+    <w:p>
+      <w:pPr>
+        <w:pStyle w:val="BlockText"/>
+      </w:pPr>
+      <w:r>
+        <w:t xml:space="preserve">✅ A machine learning problem is stated only when its</w:t>
+      </w:r>
+      <w:r>
+        <w:t xml:space="preserve"> </w:t>
+      </w:r>
+      <w:r>
+        <w:t xml:space="preserve">experience</w:t>
+      </w:r>
+      <w:r>
+        <w:t xml:space="preserve"> </w:t>
+      </w:r>
+      <m:oMath>
+        <m:r>
+          <m:t>E</m:t>
+        </m:r>
+      </m:oMath>
+      <w:r>
+        <w:t xml:space="preserve">, task</w:t>
+      </w:r>
+      <w:r>
+        <w:t xml:space="preserve"> </w:t>
+      </w:r>
+      <m:oMath>
+        <m:r>
+          <m:t>T</m:t>
+        </m:r>
+      </m:oMath>
+      <w:r>
+        <w:t xml:space="preserve"> </w:t>
+      </w:r>
+      <w:r>
+        <w:t xml:space="preserve">and performance measure</w:t>
+      </w:r>
+      <w:r>
+        <w:t xml:space="preserve"> </w:t>
+      </w:r>
+      <m:oMath>
+        <m:r>
+          <m:t>P</m:t>
+        </m:r>
+      </m:oMath>
+      <w:r>
+        <w:t xml:space="preserve"> </w:t>
+      </w:r>
+      <w:r>
+        <w:t xml:space="preserve">are named.</w:t>
+      </w:r>
+    </w:p>
+    <w:p>
+      <w:pPr>
+        <w:pStyle w:val="FirstParagraph"/>
+      </w:pPr>
+      <w:r>
+        <w:t xml:space="preserve">The first version packs six tells into two sentences:</w:t>
+      </w:r>
+    </w:p>
+    <w:p>
+      <w:pPr>
+        <w:pStyle w:val="Compact"/>
+        <w:numPr>
+          <w:ilvl w:val="0"/>
+          <w:numId w:val="1005"/>
+        </w:numPr>
+      </w:pPr>
+      <w:r>
+        <w:t xml:space="preserve">an objection raised only to be knocked down;</w:t>
+      </w:r>
+    </w:p>
+    <w:p>
+      <w:pPr>
+        <w:pStyle w:val="Compact"/>
+        <w:numPr>
+          <w:ilvl w:val="0"/>
+          <w:numId w:val="1005"/>
+        </w:numPr>
+      </w:pPr>
+      <w:r>
+        <w:t xml:space="preserve">“It”</w:t>
+      </w:r>
+      <w:r>
+        <w:t xml:space="preserve"> </w:t>
+      </w:r>
+      <w:r>
+        <w:t xml:space="preserve">and</w:t>
+      </w:r>
+      <w:r>
+        <w:t xml:space="preserve"> </w:t>
+      </w:r>
+      <w:r>
+        <w:t xml:space="preserve">“Its”</w:t>
+      </w:r>
+      <w:r>
+        <w:t xml:space="preserve"> </w:t>
+      </w:r>
+      <w:r>
+        <w:t xml:space="preserve">in place of</w:t>
+      </w:r>
+      <w:r>
+        <w:t xml:space="preserve"> </w:t>
+      </w:r>
+      <w:r>
+        <w:t xml:space="preserve">“the definition”</w:t>
+      </w:r>
+      <w:r>
+        <w:t xml:space="preserve">;</w:t>
+      </w:r>
+    </w:p>
+    <w:p>
+      <w:pPr>
+        <w:pStyle w:val="Compact"/>
+        <w:numPr>
+          <w:ilvl w:val="0"/>
+          <w:numId w:val="1005"/>
+        </w:numPr>
+      </w:pPr>
+      <w:r>
+        <w:t xml:space="preserve">a definition that</w:t>
+      </w:r>
+      <w:r>
+        <w:t xml:space="preserve"> </w:t>
+      </w:r>
+      <w:r>
+        <w:t xml:space="preserve">“forces”</w:t>
+      </w:r>
+      <w:r>
+        <w:t xml:space="preserve"> </w:t>
+      </w:r>
+      <w:r>
+        <w:t xml:space="preserve">the reader, as if it were a person;</w:t>
+      </w:r>
+    </w:p>
+    <w:p>
+      <w:pPr>
+        <w:pStyle w:val="Compact"/>
+        <w:numPr>
+          <w:ilvl w:val="0"/>
+          <w:numId w:val="1005"/>
+        </w:numPr>
+      </w:pPr>
+      <w:r>
+        <w:t xml:space="preserve">“you”</w:t>
+      </w:r>
+      <w:r>
+        <w:t xml:space="preserve"> </w:t>
+      </w:r>
+      <w:r>
+        <w:t xml:space="preserve">addressing the reader;</w:t>
+      </w:r>
+    </w:p>
+    <w:p>
+      <w:pPr>
+        <w:pStyle w:val="Compact"/>
+        <w:numPr>
+          <w:ilvl w:val="0"/>
+          <w:numId w:val="1005"/>
+        </w:numPr>
+      </w:pPr>
+      <w:r>
+        <w:t xml:space="preserve">a point withheld until after a colon;</w:t>
+      </w:r>
+    </w:p>
+    <w:p>
+      <w:pPr>
+        <w:pStyle w:val="Compact"/>
+        <w:numPr>
+          <w:ilvl w:val="0"/>
+          <w:numId w:val="1005"/>
+        </w:numPr>
+      </w:pPr>
+      <w:r>
+        <w:t xml:space="preserve">a closing aphorism.</w:t>
+      </w:r>
+    </w:p>
+    <w:p>
+      <w:pPr>
+        <w:pStyle w:val="FirstParagraph"/>
+      </w:pPr>
+      <w:r>
+        <w:t xml:space="preserve">The second version states the claim once.</w:t>
+      </w:r>
+    </w:p>
+    <w:bookmarkEnd w:id="17"/>
+    <w:p>
+      <w:pPr>
+        <w:pStyle w:val="BodyText"/>
+      </w:pPr>
+      <w:r>
+        <w:t xml:space="preserve">Watch for these shapes:</w:t>
+      </w:r>
+    </w:p>
+    <w:p>
+      <w:pPr>
+        <w:pStyle w:val="Compact"/>
+        <w:numPr>
+          <w:ilvl w:val="0"/>
+          <w:numId w:val="1006"/>
+        </w:numPr>
+      </w:pPr>
+      <w:r>
+        <w:rPr>
+          <w:b/>
+          <w:bCs/>
+        </w:rPr>
+        <w:t xml:space="preserve">The straw objection.</w:t>
+      </w:r>
+      <w:r>
+        <w:t xml:space="preserve"> </w:t>
+      </w:r>
+      <w:r>
+        <w:t xml:space="preserve">A doubt raised only to be answered</w:t>
+      </w:r>
+      <w:r>
+        <w:t xml:space="preserve"> </w:t>
+      </w:r>
+      <w:r>
+        <w:t xml:space="preserve">(</w:t>
+      </w:r>
+      <w:r>
+        <w:t xml:space="preserve">“It may seem trivial. In fact, …”</w:t>
+      </w:r>
+      <w:r>
+        <w:t xml:space="preserve">).</w:t>
+      </w:r>
+      <w:r>
+        <w:t xml:space="preserve"> </w:t>
+      </w:r>
+      <w:r>
+        <w:t xml:space="preserve">This is the antithesis spread over two sentences.</w:t>
+      </w:r>
+    </w:p>
+    <w:p>
+      <w:pPr>
+        <w:pStyle w:val="Compact"/>
+        <w:numPr>
+          <w:ilvl w:val="0"/>
+          <w:numId w:val="1006"/>
+        </w:numPr>
+      </w:pPr>
+      <w:r>
+        <w:rPr>
+          <w:b/>
+          <w:bCs/>
+        </w:rPr>
+        <w:t xml:space="preserve">The personified abstraction.</w:t>
+      </w:r>
+      <w:r>
+        <w:t xml:space="preserve"> </w:t>
+      </w:r>
+      <w:r>
+        <w:t xml:space="preserve">A definition, method or result that</w:t>
+      </w:r>
+      <w:r>
+        <w:t xml:space="preserve"> </w:t>
+      </w:r>
+      <w:r>
+        <w:t xml:space="preserve">“forces”</w:t>
+      </w:r>
+      <w:r>
+        <w:t xml:space="preserve">,</w:t>
+      </w:r>
+      <w:r>
+        <w:t xml:space="preserve"> </w:t>
+      </w:r>
+      <w:r>
+        <w:t xml:space="preserve">“invites”</w:t>
+      </w:r>
+      <w:r>
+        <w:t xml:space="preserve">,</w:t>
+      </w:r>
+      <w:r>
+        <w:t xml:space="preserve"> </w:t>
+      </w:r>
+      <w:r>
+        <w:t xml:space="preserve">“demands”</w:t>
+      </w:r>
+      <w:r>
+        <w:t xml:space="preserve"> </w:t>
+      </w:r>
+      <w:r>
+        <w:t xml:space="preserve">or</w:t>
+      </w:r>
+      <w:r>
+        <w:t xml:space="preserve"> </w:t>
+      </w:r>
+      <w:r>
+        <w:t xml:space="preserve">“asks”</w:t>
+      </w:r>
+      <w:r>
+        <w:t xml:space="preserve"> </w:t>
+      </w:r>
+      <w:r>
+        <w:t xml:space="preserve">something of the reader.</w:t>
+      </w:r>
+      <w:r>
+        <w:t xml:space="preserve"> </w:t>
+      </w:r>
+      <w:r>
+        <w:t xml:space="preserve">Name who does what.</w:t>
+      </w:r>
+    </w:p>
+    <w:p>
+      <w:pPr>
+        <w:pStyle w:val="Compact"/>
+        <w:numPr>
+          <w:ilvl w:val="0"/>
+          <w:numId w:val="1006"/>
+        </w:numPr>
+      </w:pPr>
+      <w:r>
+        <w:rPr>
+          <w:b/>
+          <w:bCs/>
+        </w:rPr>
+        <w:t xml:space="preserve">The colon reveal.</w:t>
+      </w:r>
+      <w:r>
+        <w:t xml:space="preserve"> </w:t>
+      </w:r>
+      <w:r>
+        <w:t xml:space="preserve">A setup, then a colon, then the point.</w:t>
+      </w:r>
+      <w:r>
+        <w:t xml:space="preserve"> </w:t>
+      </w:r>
+      <w:r>
+        <w:t xml:space="preserve">Lead with the point.</w:t>
+      </w:r>
+    </w:p>
+    <w:p>
+      <w:pPr>
+        <w:pStyle w:val="Compact"/>
+        <w:numPr>
+          <w:ilvl w:val="0"/>
+          <w:numId w:val="1006"/>
+        </w:numPr>
+      </w:pPr>
+      <w:r>
+        <w:rPr>
+          <w:b/>
+          <w:bCs/>
+        </w:rPr>
+        <w:t xml:space="preserve">The answered rhetorical question.</w:t>
+      </w:r>
+      <w:r>
+        <w:t xml:space="preserve"> </w:t>
+      </w:r>
+      <w:r>
+        <w:t xml:space="preserve">“The result? A faster fit.”</w:t>
+      </w:r>
+      <w:r>
+        <w:t xml:space="preserve"> </w:t>
+      </w:r>
+      <w:r>
+        <w:t xml:space="preserve">or</w:t>
+      </w:r>
+      <w:r>
+        <w:t xml:space="preserve"> </w:t>
+      </w:r>
+      <w:r>
+        <w:t xml:space="preserve">“Why does this matter? Because …”</w:t>
+      </w:r>
+      <w:r>
+        <w:t xml:space="preserve">.</w:t>
+      </w:r>
+      <w:r>
+        <w:t xml:space="preserve"> </w:t>
+      </w:r>
+      <w:r>
+        <w:t xml:space="preserve">State the result.</w:t>
+      </w:r>
+    </w:p>
+    <w:p>
+      <w:pPr>
+        <w:pStyle w:val="Compact"/>
+        <w:numPr>
+          <w:ilvl w:val="0"/>
+          <w:numId w:val="1006"/>
+        </w:numPr>
+      </w:pPr>
+      <w:r>
+        <w:rPr>
+          <w:b/>
+          <w:bCs/>
+        </w:rPr>
+        <w:t xml:space="preserve">The throat-clearing lead-in.</w:t>
+      </w:r>
+      <w:r>
+        <w:t xml:space="preserve"> </w:t>
+      </w:r>
+      <w:r>
+        <w:t xml:space="preserve">“Here’s the thing:”</w:t>
+      </w:r>
+      <w:r>
+        <w:t xml:space="preserve">,</w:t>
+      </w:r>
+      <w:r>
+        <w:t xml:space="preserve"> </w:t>
+      </w:r>
+      <w:r>
+        <w:t xml:space="preserve">“Here’s why:”</w:t>
+      </w:r>
+      <w:r>
+        <w:t xml:space="preserve">,</w:t>
+      </w:r>
+      <w:r>
+        <w:t xml:space="preserve"> </w:t>
+      </w:r>
+      <w:r>
+        <w:t xml:space="preserve">“The key is”</w:t>
+      </w:r>
+      <w:r>
+        <w:t xml:space="preserve">,</w:t>
+      </w:r>
+      <w:r>
+        <w:t xml:space="preserve"> </w:t>
+      </w:r>
+      <w:r>
+        <w:t xml:space="preserve">“Put simply,”</w:t>
+      </w:r>
+      <w:r>
+        <w:t xml:space="preserve">.</w:t>
+      </w:r>
+      <w:r>
+        <w:t xml:space="preserve"> </w:t>
+      </w:r>
+      <w:r>
+        <w:t xml:space="preserve">Delete the lead-in.</w:t>
+      </w:r>
+    </w:p>
+    <w:p>
+      <w:pPr>
+        <w:pStyle w:val="Compact"/>
+        <w:numPr>
+          <w:ilvl w:val="0"/>
+          <w:numId w:val="1006"/>
+        </w:numPr>
+      </w:pPr>
+      <w:r>
+        <w:rPr>
+          <w:b/>
+          <w:bCs/>
+        </w:rPr>
+        <w:t xml:space="preserve">The reframe.</w:t>
+      </w:r>
+      <w:r>
+        <w:t xml:space="preserve"> </w:t>
+      </w:r>
+      <w:r>
+        <w:t xml:space="preserve">“X isn’t about Y; it’s about Z”</w:t>
+      </w:r>
+      <w:r>
+        <w:t xml:space="preserve">,</w:t>
+      </w:r>
+      <w:r>
+        <w:t xml:space="preserve"> </w:t>
+      </w:r>
+      <w:r>
+        <w:t xml:space="preserve">“The question isn’t X, it’s Y”</w:t>
+      </w:r>
+      <w:r>
+        <w:t xml:space="preserve">,</w:t>
+      </w:r>
+      <w:r>
+        <w:t xml:space="preserve"> </w:t>
+      </w:r>
+      <w:r>
+        <w:t xml:space="preserve">and</w:t>
+      </w:r>
+      <w:r>
+        <w:t xml:space="preserve"> </w:t>
+      </w:r>
+      <w:r>
+        <w:t xml:space="preserve">“not because X, but because Y”</w:t>
+      </w:r>
+      <w:r>
+        <w:t xml:space="preserve">.</w:t>
+      </w:r>
+      <w:r>
+        <w:t xml:space="preserve"> </w:t>
+      </w:r>
+      <w:r>
+        <w:t xml:space="preserve">Say what X is about.</w:t>
+      </w:r>
+    </w:p>
+    <w:p>
+      <w:pPr>
+        <w:pStyle w:val="Compact"/>
+        <w:numPr>
+          <w:ilvl w:val="0"/>
+          <w:numId w:val="1006"/>
+        </w:numPr>
+      </w:pPr>
+      <w:r>
+        <w:rPr>
+          <w:b/>
+          <w:bCs/>
+        </w:rPr>
+        <w:t xml:space="preserve">Fragment emphasis.</w:t>
+      </w:r>
+      <w:r>
+        <w:t xml:space="preserve"> </w:t>
+      </w:r>
+      <w:r>
+        <w:t xml:space="preserve">“Simple. Fast. Reliable.”</w:t>
+      </w:r>
+      <w:r>
+        <w:t xml:space="preserve"> </w:t>
+      </w:r>
+      <w:r>
+        <w:t xml:space="preserve">Write a sentence with a subject and a verb.</w:t>
+      </w:r>
+    </w:p>
+    <w:p>
+      <w:pPr>
+        <w:pStyle w:val="Compact"/>
+        <w:numPr>
+          <w:ilvl w:val="0"/>
+          <w:numId w:val="1006"/>
+        </w:numPr>
+      </w:pPr>
+      <w:r>
+        <w:rPr>
+          <w:b/>
+          <w:bCs/>
+        </w:rPr>
+        <w:t xml:space="preserve">The editorializing tail.</w:t>
+      </w:r>
+      <w:r>
+        <w:t xml:space="preserve"> </w:t>
+      </w:r>
+      <w:r>
+        <w:t xml:space="preserve">A trailing participial clause that</w:t>
+      </w:r>
+      <w:r>
+        <w:t xml:space="preserve"> </w:t>
+      </w:r>
+      <w:r>
+        <w:t xml:space="preserve">comments on the sentence:</w:t>
+      </w:r>
+      <w:r>
+        <w:t xml:space="preserve"> </w:t>
+      </w:r>
+      <w:r>
+        <w:t xml:space="preserve">“, highlighting the importance of …”</w:t>
+      </w:r>
+      <w:r>
+        <w:t xml:space="preserve">,</w:t>
+      </w:r>
+      <w:r>
+        <w:t xml:space="preserve"> </w:t>
+      </w:r>
+      <w:r>
+        <w:t xml:space="preserve">“, ensuring that …”</w:t>
+      </w:r>
+      <w:r>
+        <w:t xml:space="preserve">,</w:t>
+      </w:r>
+      <w:r>
+        <w:t xml:space="preserve"> </w:t>
+      </w:r>
+      <w:r>
+        <w:t xml:space="preserve">“, making it ideal for …”</w:t>
+      </w:r>
+      <w:r>
+        <w:t xml:space="preserve">.</w:t>
+      </w:r>
+      <w:r>
+        <w:t xml:space="preserve"> </w:t>
+      </w:r>
+      <w:r>
+        <w:t xml:space="preserve">End the sentence at its claim.</w:t>
+      </w:r>
+    </w:p>
+    <w:p>
+      <w:pPr>
+        <w:pStyle w:val="Compact"/>
+        <w:numPr>
+          <w:ilvl w:val="0"/>
+          <w:numId w:val="1006"/>
+        </w:numPr>
+      </w:pPr>
+      <w:r>
+        <w:rPr>
+          <w:b/>
+          <w:bCs/>
+        </w:rPr>
+        <w:t xml:space="preserve">The inflated copula.</w:t>
+      </w:r>
+      <w:r>
+        <w:t xml:space="preserve"> </w:t>
+      </w:r>
+      <w:r>
+        <w:t xml:space="preserve">“Serves as”</w:t>
+      </w:r>
+      <w:r>
+        <w:t xml:space="preserve">,</w:t>
+      </w:r>
+      <w:r>
+        <w:t xml:space="preserve"> </w:t>
+      </w:r>
+      <w:r>
+        <w:t xml:space="preserve">“stands as”</w:t>
+      </w:r>
+      <w:r>
+        <w:t xml:space="preserve"> </w:t>
+      </w:r>
+      <w:r>
+        <w:t xml:space="preserve">and</w:t>
+      </w:r>
+      <w:r>
+        <w:t xml:space="preserve"> </w:t>
+      </w:r>
+      <w:r>
+        <w:t xml:space="preserve">“acts as”</w:t>
+      </w:r>
+      <w:r>
+        <w:t xml:space="preserve"> </w:t>
+      </w:r>
+      <w:r>
+        <w:t xml:space="preserve">where</w:t>
+      </w:r>
+      <w:r>
+        <w:t xml:space="preserve"> </w:t>
+      </w:r>
+      <w:r>
+        <w:t xml:space="preserve">“is”</w:t>
+      </w:r>
+      <w:r>
+        <w:t xml:space="preserve"> </w:t>
+      </w:r>
+      <w:r>
+        <w:t xml:space="preserve">says the same.</w:t>
+      </w:r>
+    </w:p>
+    <w:p>
+      <w:pPr>
+        <w:pStyle w:val="Compact"/>
+        <w:numPr>
+          <w:ilvl w:val="0"/>
+          <w:numId w:val="1006"/>
+        </w:numPr>
+      </w:pPr>
+      <w:r>
+        <w:rPr>
+          <w:b/>
+          <w:bCs/>
+        </w:rPr>
+        <w:t xml:space="preserve">The range frame.</w:t>
+      </w:r>
+      <w:r>
+        <w:t xml:space="preserve"> </w:t>
+      </w:r>
+      <w:r>
+        <w:t xml:space="preserve">“From X to Y”</w:t>
+      </w:r>
+      <w:r>
+        <w:t xml:space="preserve"> </w:t>
+      </w:r>
+      <w:r>
+        <w:t xml:space="preserve">listing two extremes</w:t>
+      </w:r>
+      <w:r>
+        <w:t xml:space="preserve"> </w:t>
+      </w:r>
+      <w:r>
+        <w:t xml:space="preserve">instead of naming the scope.</w:t>
+      </w:r>
+    </w:p>
+    <w:p>
+      <w:pPr>
+        <w:pStyle w:val="Compact"/>
+        <w:numPr>
+          <w:ilvl w:val="0"/>
+          <w:numId w:val="1006"/>
+        </w:numPr>
+      </w:pPr>
+      <w:r>
+        <w:rPr>
+          <w:b/>
+          <w:bCs/>
+        </w:rPr>
+        <w:t xml:space="preserve">The audience frame.</w:t>
+      </w:r>
+      <w:r>
+        <w:t xml:space="preserve"> </w:t>
+      </w:r>
+      <w:r>
+        <w:t xml:space="preserve">“Whether you’re a student or a researcher, …”</w:t>
+      </w:r>
+      <w:r>
+        <w:t xml:space="preserve">.</w:t>
+      </w:r>
+      <w:r>
+        <w:t xml:space="preserve"> </w:t>
+      </w:r>
+      <w:r>
+        <w:t xml:space="preserve">Drop it.</w:t>
+      </w:r>
+    </w:p>
+    <w:p>
+      <w:pPr>
+        <w:pStyle w:val="Compact"/>
+        <w:numPr>
+          <w:ilvl w:val="0"/>
+          <w:numId w:val="1006"/>
+        </w:numPr>
+      </w:pPr>
+      <w:r>
+        <w:rPr>
+          <w:b/>
+          <w:bCs/>
+        </w:rPr>
+        <w:t xml:space="preserve">The restatement.</w:t>
+      </w:r>
+      <w:r>
+        <w:t xml:space="preserve"> </w:t>
+      </w:r>
+      <w:r>
+        <w:t xml:space="preserve">“In other words, …”</w:t>
+      </w:r>
+      <w:r>
+        <w:t xml:space="preserve"> </w:t>
+      </w:r>
+      <w:r>
+        <w:t xml:space="preserve">repeating the previous sentence.</w:t>
+      </w:r>
+      <w:r>
+        <w:t xml:space="preserve"> </w:t>
+      </w:r>
+      <w:r>
+        <w:t xml:space="preserve">Keep the clearer of the two.</w:t>
+      </w:r>
+    </w:p>
+    <w:p>
+      <w:pPr>
+        <w:pStyle w:val="Compact"/>
+        <w:numPr>
+          <w:ilvl w:val="0"/>
+          <w:numId w:val="1006"/>
+        </w:numPr>
+      </w:pPr>
+      <w:r>
+        <w:rPr>
+          <w:b/>
+          <w:bCs/>
+        </w:rPr>
+        <w:t xml:space="preserve">The closing aphorism.</w:t>
+      </w:r>
+      <w:r>
+        <w:t xml:space="preserve"> </w:t>
+      </w:r>
+      <w:r>
+        <w:t xml:space="preserve">A one-line verdict at the end of a paragraph:</w:t>
+      </w:r>
+      <w:r>
+        <w:t xml:space="preserve"> </w:t>
+      </w:r>
+      <w:r>
+        <w:t xml:space="preserve">“And that’s the point.”</w:t>
+      </w:r>
+      <w:r>
+        <w:t xml:space="preserve">,</w:t>
+      </w:r>
+      <w:r>
+        <w:t xml:space="preserve"> </w:t>
+      </w:r>
+      <w:r>
+        <w:t xml:space="preserve">“Simple as that.”</w:t>
+      </w:r>
+      <w:r>
+        <w:t xml:space="preserve">,</w:t>
+      </w:r>
+      <w:r>
+        <w:t xml:space="preserve"> </w:t>
+      </w:r>
+      <w:r>
+        <w:t xml:space="preserve">“… has not yet stated a problem.”</w:t>
+      </w:r>
+      <w:r>
+        <w:t xml:space="preserve"> </w:t>
+      </w:r>
+      <w:r>
+        <w:t xml:space="preserve">End on the last piece of content.</w:t>
+      </w:r>
+    </w:p>
+    <w:p>
+      <w:pPr>
+        <w:pStyle w:val="Compact"/>
+        <w:numPr>
+          <w:ilvl w:val="0"/>
+          <w:numId w:val="1006"/>
+        </w:numPr>
+      </w:pPr>
+      <w:r>
+        <w:rPr>
+          <w:b/>
+          <w:bCs/>
+        </w:rPr>
+        <w:t xml:space="preserve">Sincerity intensifiers.</w:t>
+      </w:r>
+      <w:r>
+        <w:t xml:space="preserve"> </w:t>
+      </w:r>
+      <w:r>
+        <w:t xml:space="preserve">“Genuinely”</w:t>
+      </w:r>
+      <w:r>
+        <w:t xml:space="preserve">,</w:t>
+      </w:r>
+      <w:r>
+        <w:t xml:space="preserve"> </w:t>
+      </w:r>
+      <w:r>
+        <w:t xml:space="preserve">“truly”</w:t>
+      </w:r>
+      <w:r>
+        <w:t xml:space="preserve">,</w:t>
+      </w:r>
+      <w:r>
+        <w:t xml:space="preserve"> </w:t>
+      </w:r>
+      <w:r>
+        <w:t xml:space="preserve">“actually”</w:t>
+      </w:r>
+      <w:r>
+        <w:t xml:space="preserve">,</w:t>
+      </w:r>
+      <w:r>
+        <w:t xml:space="preserve"> </w:t>
+      </w:r>
+      <w:r>
+        <w:t xml:space="preserve">“really”</w:t>
+      </w:r>
+      <w:r>
+        <w:t xml:space="preserve"> </w:t>
+      </w:r>
+      <w:r>
+        <w:t xml:space="preserve">and</w:t>
+      </w:r>
+      <w:r>
+        <w:t xml:space="preserve"> </w:t>
+      </w:r>
+      <w:r>
+        <w:t xml:space="preserve">“crucially”</w:t>
+      </w:r>
+      <w:r>
+        <w:t xml:space="preserve"> </w:t>
+      </w:r>
+      <w:r>
+        <w:t xml:space="preserve">used to sound earnest.</w:t>
+      </w:r>
+      <w:r>
+        <w:t xml:space="preserve"> </w:t>
+      </w:r>
+      <w:r>
+        <w:t xml:space="preserve">Cut them.</w:t>
+      </w:r>
+    </w:p>
+    <w:p>
+      <w:pPr>
+        <w:pStyle w:val="Compact"/>
+        <w:numPr>
+          <w:ilvl w:val="0"/>
+          <w:numId w:val="1006"/>
+        </w:numPr>
+      </w:pPr>
+      <w:r>
+        <w:rPr>
+          <w:b/>
+          <w:bCs/>
+        </w:rPr>
+        <w:t xml:space="preserve">Chained connectors.</w:t>
+      </w:r>
+      <w:r>
+        <w:t xml:space="preserve"> </w:t>
+      </w:r>
+      <w:r>
+        <w:t xml:space="preserve">“Furthermore”</w:t>
+      </w:r>
+      <w:r>
+        <w:t xml:space="preserve">,</w:t>
+      </w:r>
+      <w:r>
+        <w:t xml:space="preserve"> </w:t>
+      </w:r>
+      <w:r>
+        <w:t xml:space="preserve">“Moreover”</w:t>
+      </w:r>
+      <w:r>
+        <w:t xml:space="preserve"> </w:t>
+      </w:r>
+      <w:r>
+        <w:t xml:space="preserve">and</w:t>
+      </w:r>
+      <w:r>
+        <w:t xml:space="preserve"> </w:t>
+      </w:r>
+      <w:r>
+        <w:t xml:space="preserve">“Additionally”</w:t>
+      </w:r>
+      <w:r>
+        <w:t xml:space="preserve"> </w:t>
+      </w:r>
+      <w:r>
+        <w:t xml:space="preserve">opening consecutive sentences.</w:t>
+      </w:r>
+      <w:r>
+        <w:t xml:space="preserve"> </w:t>
+      </w:r>
+      <w:r>
+        <w:t xml:space="preserve">Most can go; the order already signals addition.</w:t>
+      </w:r>
+    </w:p>
+    <w:p>
+      <w:pPr>
+        <w:pStyle w:val="Compact"/>
+        <w:numPr>
+          <w:ilvl w:val="0"/>
+          <w:numId w:val="1006"/>
+        </w:numPr>
+      </w:pPr>
+      <w:r>
+        <w:rPr>
+          <w:b/>
+          <w:bCs/>
+        </w:rPr>
+        <w:t xml:space="preserve">Assistant chatter.</w:t>
+      </w:r>
+      <w:r>
+        <w:t xml:space="preserve"> </w:t>
+      </w:r>
+      <w:r>
+        <w:t xml:space="preserve">“Let’s dive in”</w:t>
+      </w:r>
+      <w:r>
+        <w:t xml:space="preserve">,</w:t>
+      </w:r>
+      <w:r>
+        <w:t xml:space="preserve"> </w:t>
+      </w:r>
+      <w:r>
+        <w:t xml:space="preserve">“Let’s unpack this”</w:t>
+      </w:r>
+      <w:r>
+        <w:t xml:space="preserve">,</w:t>
+      </w:r>
+      <w:r>
+        <w:t xml:space="preserve"> </w:t>
+      </w:r>
+      <w:r>
+        <w:t xml:space="preserve">“Great question”</w:t>
+      </w:r>
+      <w:r>
+        <w:t xml:space="preserve"> </w:t>
+      </w:r>
+      <w:r>
+        <w:t xml:space="preserve">and</w:t>
+      </w:r>
+      <w:r>
+        <w:t xml:space="preserve"> </w:t>
+      </w:r>
+      <w:r>
+        <w:t xml:space="preserve">“I hope this helps”</w:t>
+      </w:r>
+      <w:r>
+        <w:t xml:space="preserve"> </w:t>
+      </w:r>
+      <w:r>
+        <w:t xml:space="preserve">belong in a chat window, not a document.</w:t>
+      </w:r>
+    </w:p>
+    <w:p>
+      <w:pPr>
+        <w:pStyle w:val="FirstParagraph"/>
+      </w:pPr>
+      <w:r>
+        <w:t xml:space="preserve">Four more habits blur the referent or delay the claim.</w:t>
+      </w:r>
+      <w:r>
+        <w:t xml:space="preserve"> </w:t>
+      </w:r>
+      <w:r>
+        <w:t xml:space="preserve">Other chapters cover each:</w:t>
+      </w:r>
+    </w:p>
+    <w:p>
+      <w:pPr>
+        <w:pStyle w:val="Compact"/>
+        <w:numPr>
+          <w:ilvl w:val="0"/>
+          <w:numId w:val="1007"/>
+        </w:numPr>
+      </w:pPr>
+      <w:r>
+        <w:t xml:space="preserve">a demonstrative standing in for its referent</w:t>
+      </w:r>
+      <w:r>
+        <w:t xml:space="preserve"> </w:t>
+      </w:r>
+      <w:r>
+        <w:t xml:space="preserve">(</w:t>
+      </w:r>
+      <w:hyperlink r:id="rId18">
+        <w:r>
+          <w:rPr>
+            <w:rStyle w:val="Hyperlink"/>
+          </w:rPr>
+          <w:t xml:space="preserve">Demonstrative pronouns</w:t>
+        </w:r>
+      </w:hyperlink>
+      <w:r>
+        <w:t xml:space="preserve">);</w:t>
+      </w:r>
+    </w:p>
+    <w:p>
+      <w:pPr>
+        <w:pStyle w:val="Compact"/>
+        <w:numPr>
+          <w:ilvl w:val="0"/>
+          <w:numId w:val="1007"/>
+        </w:numPr>
+      </w:pPr>
+      <w:r>
+        <w:t xml:space="preserve">the word</w:t>
+      </w:r>
+      <w:r>
+        <w:t xml:space="preserve"> </w:t>
+      </w:r>
+      <w:r>
+        <w:t xml:space="preserve">“thing”</w:t>
+      </w:r>
+      <w:r>
+        <w:t xml:space="preserve"> </w:t>
+      </w:r>
+      <w:r>
+        <w:t xml:space="preserve">(</w:t>
+      </w:r>
+      <w:hyperlink r:id="rId19">
+        <w:r>
+          <w:rPr>
+            <w:rStyle w:val="Hyperlink"/>
+          </w:rPr>
+          <w:t xml:space="preserve">Say which thing</w:t>
+        </w:r>
+      </w:hyperlink>
+      <w:r>
+        <w:t xml:space="preserve">);</w:t>
+      </w:r>
+    </w:p>
+    <w:p>
+      <w:pPr>
+        <w:pStyle w:val="Compact"/>
+        <w:numPr>
+          <w:ilvl w:val="0"/>
+          <w:numId w:val="1007"/>
+        </w:numPr>
+      </w:pPr>
+      <w:r>
+        <w:t xml:space="preserve">a dependent clause opening a sentence</w:t>
+      </w:r>
+      <w:r>
+        <w:t xml:space="preserve"> </w:t>
+      </w:r>
+      <w:r>
+        <w:t xml:space="preserve">(</w:t>
+      </w:r>
+      <w:hyperlink r:id="rId20">
+        <w:r>
+          <w:rPr>
+            <w:rStyle w:val="Hyperlink"/>
+          </w:rPr>
+          <w:t xml:space="preserve">Lead with the subject</w:t>
+        </w:r>
+      </w:hyperlink>
+      <w:r>
+        <w:t xml:space="preserve">);</w:t>
+      </w:r>
+    </w:p>
+    <w:p>
+      <w:pPr>
+        <w:pStyle w:val="Compact"/>
+        <w:numPr>
+          <w:ilvl w:val="0"/>
+          <w:numId w:val="1007"/>
+        </w:numPr>
+      </w:pPr>
+      <w:r>
+        <w:t xml:space="preserve">informal idioms</w:t>
+      </w:r>
+      <w:r>
+        <w:t xml:space="preserve"> </w:t>
+      </w:r>
+      <w:r>
+        <w:t xml:space="preserve">(</w:t>
+      </w:r>
+      <w:hyperlink r:id="rId21">
+        <w:r>
+          <w:rPr>
+            <w:rStyle w:val="Hyperlink"/>
+          </w:rPr>
+          <w:t xml:space="preserve">Avoid vague and metaphorical language</w:t>
+        </w:r>
+      </w:hyperlink>
+      <w:r>
+        <w:t xml:space="preserve">).</w:t>
+      </w:r>
+    </w:p>
+    <w:bookmarkEnd w:id="22"/>
+    <w:bookmarkStart w:id="23" w:name="formatting-habits"/>
+    <w:p>
+      <w:pPr>
+        <w:pStyle w:val="Heading2"/>
+      </w:pPr>
+      <w:r>
+        <w:t xml:space="preserve">4 Formatting habits</w:t>
+      </w:r>
+    </w:p>
+    <w:p>
+      <w:pPr>
+        <w:pStyle w:val="FirstParagraph"/>
+      </w:pPr>
+      <w:r>
         <w:t xml:space="preserve">Some tells are typographic rather than verbal.</w:t>
       </w:r>
     </w:p>
@@ -1000,7 +2962,7 @@
         <w:pStyle w:val="Compact"/>
         <w:numPr>
           <w:ilvl w:val="0"/>
-          <w:numId w:val="1002"/>
+          <w:numId w:val="1008"/>
         </w:numPr>
       </w:pPr>
       <w:r>
@@ -1034,7 +2996,7 @@
         <w:pStyle w:val="Compact"/>
         <w:numPr>
           <w:ilvl w:val="0"/>
-          <w:numId w:val="1002"/>
+          <w:numId w:val="1008"/>
         </w:numPr>
       </w:pPr>
       <w:r>
@@ -1083,7 +3045,7 @@
         <w:pStyle w:val="Compact"/>
         <w:numPr>
           <w:ilvl w:val="0"/>
-          <w:numId w:val="1002"/>
+          <w:numId w:val="1008"/>
         </w:numPr>
       </w:pPr>
       <w:r>
@@ -1111,7 +3073,7 @@
         <w:pStyle w:val="Compact"/>
         <w:numPr>
           <w:ilvl w:val="0"/>
-          <w:numId w:val="1002"/>
+          <w:numId w:val="1008"/>
         </w:numPr>
       </w:pPr>
       <w:r>
@@ -1140,14 +3102,14 @@
         <w:t xml:space="preserve">ideas.</w:t>
       </w:r>
     </w:p>
-    <w:bookmarkEnd w:id="17"/>
-    <w:bookmarkStart w:id="19" w:name="tone"/>
+    <w:bookmarkEnd w:id="23"/>
+    <w:bookmarkStart w:id="25" w:name="tone"/>
     <w:p>
       <w:pPr>
         <w:pStyle w:val="Heading2"/>
       </w:pPr>
       <w:r>
-        <w:t xml:space="preserve">4 Tone</w:t>
+        <w:t xml:space="preserve">5 Tone</w:t>
       </w:r>
     </w:p>
     <w:p>
@@ -1163,7 +3125,7 @@
         <w:pStyle w:val="Compact"/>
         <w:numPr>
           <w:ilvl w:val="0"/>
-          <w:numId w:val="1003"/>
+          <w:numId w:val="1009"/>
         </w:numPr>
       </w:pPr>
       <w:r>
@@ -1221,7 +3183,7 @@
         <w:pStyle w:val="Compact"/>
         <w:numPr>
           <w:ilvl w:val="0"/>
-          <w:numId w:val="1003"/>
+          <w:numId w:val="1009"/>
         </w:numPr>
       </w:pPr>
       <w:r>
@@ -1267,7 +3229,7 @@
         <w:pStyle w:val="Compact"/>
         <w:numPr>
           <w:ilvl w:val="0"/>
-          <w:numId w:val="1003"/>
+          <w:numId w:val="1009"/>
         </w:numPr>
       </w:pPr>
       <w:r>
@@ -1313,7 +3275,7 @@
       <w:r>
         <w:t xml:space="preserve"> </w:t>
       </w:r>
-      <w:hyperlink r:id="rId18">
+      <w:hyperlink r:id="rId24">
         <w:r>
           <w:rPr>
             <w:rStyle w:val="Hyperlink"/>
@@ -1366,7 +3328,7 @@
         <w:t xml:space="preserve">not prose that has been sanded smooth.</w:t>
       </w:r>
     </w:p>
-    <w:bookmarkEnd w:id="19"/>
+    <w:bookmarkEnd w:id="25"/>
     <w:sectPr>
       <w:footnotePr>
         <w:numRestart w:val="eachSect"/>
@@ -1590,6 +3552,24 @@
     <w:abstractNumId w:val="991"/>
   </w:num>
   <w:num w:numId="1003">
+    <w:abstractNumId w:val="991"/>
+  </w:num>
+  <w:num w:numId="1004">
+    <w:abstractNumId w:val="991"/>
+  </w:num>
+  <w:num w:numId="1005">
+    <w:abstractNumId w:val="991"/>
+  </w:num>
+  <w:num w:numId="1006">
+    <w:abstractNumId w:val="991"/>
+  </w:num>
+  <w:num w:numId="1007">
+    <w:abstractNumId w:val="991"/>
+  </w:num>
+  <w:num w:numId="1008">
+    <w:abstractNumId w:val="991"/>
+  </w:num>
+  <w:num w:numId="1009">
     <w:abstractNumId w:val="991"/>
   </w:num>
 </w:numbering>

</xml_diff>

<commit_message>
Deploying to gh-pages from @ Morrison-Lab/psw@00ade41c752b09d17e7790784ef0c302b35ecc4d 🚀
</commit_message>
<xml_diff>
--- a/chapters/avoid-ai-tells.docx
+++ b/chapters/avoid-ai-tells.docx
@@ -15,7 +15,7 @@
         <w:pStyle w:val="Date"/>
       </w:pPr>
       <w:r>
-        <w:t xml:space="preserve">Last modified: 2026-10-11 20:38:16 (PDT)</w:t>
+        <w:t xml:space="preserve">Last modified: 2026-10-11 20:42:52 (PDT)</w:t>
       </w:r>
     </w:p>
     <w:tbl>
@@ -1148,6 +1148,32 @@
                 </w:p>
               </w:tc>
             </w:tr>
+            <w:tr>
+              <w:tc>
+                <w:tcPr/>
+                <w:p>
+                  <w:pPr>
+                    <w:pStyle w:val="Compact"/>
+                    <w:jc w:val="center"/>
+                  </w:pPr>
+                  <w:r>
+                    <w:t xml:space="preserve">ship(s) with</w:t>
+                  </w:r>
+                </w:p>
+              </w:tc>
+              <w:tc>
+                <w:tcPr/>
+                <w:p>
+                  <w:pPr>
+                    <w:pStyle w:val="Compact"/>
+                    <w:jc w:val="center"/>
+                  </w:pPr>
+                  <w:r>
+                    <w:t xml:space="preserve">come(s) with, accompany, are included with</w:t>
+                  </w:r>
+                </w:p>
+              </w:tc>
+            </w:tr>
           </w:tbl>
           <w:bookmarkEnd w:id="13"/>
           <w:p/>
@@ -1714,13 +1740,13 @@
       </w:r>
     </w:p>
     <w:bookmarkEnd w:id="16"/>
-    <w:bookmarkStart w:id="22" w:name="clichéd-sentence-shapes"/>
+    <w:bookmarkStart w:id="19" w:name="say-what-it-is-before-what-it-is-not"/>
     <w:p>
       <w:pPr>
         <w:pStyle w:val="Heading2"/>
       </w:pPr>
       <w:r>
-        <w:t xml:space="preserve">3 Clichéd sentence shapes</w:t>
+        <w:t xml:space="preserve">3 Say what it is before what it is not</w:t>
       </w:r>
     </w:p>
     <w:p>
@@ -1728,22 +1754,40 @@
         <w:pStyle w:val="FirstParagraph"/>
       </w:pPr>
       <w:r>
-        <w:t xml:space="preserve">Beyond the antithesis,</w:t>
-      </w:r>
-      <w:r>
-        <w:t xml:space="preserve"> </w:t>
-      </w:r>
-      <w:r>
-        <w:t xml:space="preserve">AI drafts lean on a set of sentence shapes</w:t>
-      </w:r>
-      <w:r>
-        <w:t xml:space="preserve"> </w:t>
-      </w:r>
-      <w:r>
-        <w:t xml:space="preserve">that stage a point instead of stating it.</w:t>
-      </w:r>
-    </w:p>
-    <w:bookmarkStart w:id="17" w:name="exm-staged-point"/>
+        <w:t xml:space="preserve">When a sentence needs both a positive claim and a denial,</w:t>
+      </w:r>
+      <w:r>
+        <w:t xml:space="preserve"> </w:t>
+      </w:r>
+      <w:r>
+        <w:t xml:space="preserve">state the positive claim first.</w:t>
+      </w:r>
+      <w:r>
+        <w:t xml:space="preserve"> </w:t>
+      </w:r>
+      <w:r>
+        <w:t xml:space="preserve">The reader learns what the subject is before being told what to rule out,</w:t>
+      </w:r>
+      <w:r>
+        <w:t xml:space="preserve"> </w:t>
+      </w:r>
+      <w:r>
+        <w:t xml:space="preserve">and the denial then attaches to a claim already made.</w:t>
+      </w:r>
+      <w:r>
+        <w:t xml:space="preserve"> </w:t>
+      </w:r>
+      <w:r>
+        <w:t xml:space="preserve">Opening with the denial makes the reader carry an unsupported denial</w:t>
+      </w:r>
+      <w:r>
+        <w:t xml:space="preserve"> </w:t>
+      </w:r>
+      <w:r>
+        <w:t xml:space="preserve">until the second clause arrives.</w:t>
+      </w:r>
+    </w:p>
+    <w:bookmarkStart w:id="18" w:name="exm-positive-first"/>
     <w:p>
       <w:pPr>
         <w:pStyle w:val="BodyText"/>
@@ -1753,7 +1797,209 @@
           <w:b/>
           <w:bCs/>
         </w:rPr>
-        <w:t xml:space="preserve">Example 2 (A staged point)</w:t>
+        <w:t xml:space="preserve">Example 2 (Positive claim, then denial)</w:t>
+      </w:r>
+      <w:r>
+        <w:t xml:space="preserve"> </w:t>
+      </w:r>
+      <w:r>
+        <w:t xml:space="preserve"> </w:t>
+      </w:r>
+    </w:p>
+    <w:p>
+      <w:pPr>
+        <w:pStyle w:val="BlockText"/>
+      </w:pPr>
+      <w:r>
+        <w:t xml:space="preserve">❌ The padding is not a convention, it is an identity.</w:t>
+      </w:r>
+    </w:p>
+    <w:p>
+      <w:pPr>
+        <w:pStyle w:val="BlockText"/>
+      </w:pPr>
+      <w:r>
+        <w:t xml:space="preserve">✅ The padding is an identity, not a convention.</w:t>
+      </w:r>
+    </w:p>
+    <w:p>
+      <w:pPr>
+        <w:pStyle w:val="FirstParagraph"/>
+      </w:pPr>
+      <w:r>
+        <w:t xml:space="preserve">The first version says</w:t>
+      </w:r>
+      <w:r>
+        <w:t xml:space="preserve"> </w:t>
+      </w:r>
+      <w:r>
+        <w:t xml:space="preserve">“not a convention”</w:t>
+      </w:r>
+      <w:r>
+        <w:t xml:space="preserve"> </w:t>
+      </w:r>
+      <w:r>
+        <w:t xml:space="preserve">before the reader knows what the padding is,</w:t>
+      </w:r>
+      <w:r>
+        <w:t xml:space="preserve"> </w:t>
+      </w:r>
+      <w:r>
+        <w:t xml:space="preserve">then repeats the subject and verb to supply the claim.</w:t>
+      </w:r>
+      <w:r>
+        <w:t xml:space="preserve"> </w:t>
+      </w:r>
+      <w:r>
+        <w:t xml:space="preserve">The second version states the claim once and ends on the contrast.</w:t>
+      </w:r>
+    </w:p>
+    <w:p>
+      <w:pPr>
+        <w:pStyle w:val="BodyText"/>
+      </w:pPr>
+      <w:r>
+        <w:t xml:space="preserve">The order matters even when the sentence stays grammatical:</w:t>
+      </w:r>
+    </w:p>
+    <w:p>
+      <w:pPr>
+        <w:pStyle w:val="BlockText"/>
+      </w:pPr>
+      <w:r>
+        <w:t xml:space="preserve">❌ The padding is not a convention but an identity.</w:t>
+      </w:r>
+    </w:p>
+    <w:p>
+      <w:pPr>
+        <w:pStyle w:val="BlockText"/>
+      </w:pPr>
+      <w:r>
+        <w:t xml:space="preserve">✅ The padding is an identity, not a convention.</w:t>
+      </w:r>
+    </w:p>
+    <w:p>
+      <w:pPr>
+        <w:pStyle w:val="FirstParagraph"/>
+      </w:pPr>
+      <w:r>
+        <w:t xml:space="preserve">Both are correct sentences; the second puts the claim first.</w:t>
+      </w:r>
+      <w:r>
+        <w:t xml:space="preserve"> </w:t>
+      </w:r>
+      <w:r>
+        <w:t xml:space="preserve">The first pair is from the</w:t>
+      </w:r>
+      <w:r>
+        <w:t xml:space="preserve"> </w:t>
+      </w:r>
+      <w:hyperlink r:id="rId17">
+        <w:r>
+          <w:rPr>
+            <w:rStyle w:val="Hyperlink"/>
+          </w:rPr>
+          <w:t xml:space="preserve">linear regression chapter of lds</w:t>
+        </w:r>
+      </w:hyperlink>
+      <w:r>
+        <w:t xml:space="preserve">.</w:t>
+      </w:r>
+    </w:p>
+    <w:bookmarkEnd w:id="18"/>
+    <w:p>
+      <w:pPr>
+        <w:pStyle w:val="BodyText"/>
+      </w:pPr>
+      <w:r>
+        <w:t xml:space="preserve">Often the denial can be cut.</w:t>
+      </w:r>
+      <w:r>
+        <w:t xml:space="preserve"> </w:t>
+      </w:r>
+      <w:r>
+        <w:t xml:space="preserve">Keep it only when the reader might plausibly believe the rejected reading,</w:t>
+      </w:r>
+      <w:r>
+        <w:t xml:space="preserve"> </w:t>
+      </w:r>
+      <w:r>
+        <w:t xml:space="preserve">as with a convention versus an identity.</w:t>
+      </w:r>
+      <w:r>
+        <w:t xml:space="preserve"> </w:t>
+      </w:r>
+      <w:r>
+        <w:t xml:space="preserve">A denial that rejects a view nobody holds is the reframe</w:t>
+      </w:r>
+      <w:r>
+        <w:t xml:space="preserve"> </w:t>
+      </w:r>
+      <w:r>
+        <w:t xml:space="preserve">(see</w:t>
+      </w:r>
+      <w:r>
+        <w:t xml:space="preserve"> </w:t>
+      </w:r>
+      <w:hyperlink w:anchor="clichéd-sentence-shapes">
+        <w:r>
+          <w:rPr>
+            <w:rStyle w:val="Hyperlink"/>
+          </w:rPr>
+          <w:t xml:space="preserve">Clichéd sentence shapes</w:t>
+        </w:r>
+      </w:hyperlink>
+      <w:r>
+        <w:t xml:space="preserve">) in miniature:</w:t>
+      </w:r>
+      <w:r>
+        <w:t xml:space="preserve"> </w:t>
+      </w:r>
+      <w:r>
+        <w:t xml:space="preserve">cut it and keep the claim.</w:t>
+      </w:r>
+    </w:p>
+    <w:bookmarkEnd w:id="19"/>
+    <w:bookmarkStart w:id="25" w:name="clichéd-sentence-shapes"/>
+    <w:p>
+      <w:pPr>
+        <w:pStyle w:val="Heading2"/>
+      </w:pPr>
+      <w:r>
+        <w:t xml:space="preserve">4 Clichéd sentence shapes</w:t>
+      </w:r>
+    </w:p>
+    <w:p>
+      <w:pPr>
+        <w:pStyle w:val="FirstParagraph"/>
+      </w:pPr>
+      <w:r>
+        <w:t xml:space="preserve">Beyond the antithesis,</w:t>
+      </w:r>
+      <w:r>
+        <w:t xml:space="preserve"> </w:t>
+      </w:r>
+      <w:r>
+        <w:t xml:space="preserve">AI drafts lean on a set of sentence shapes</w:t>
+      </w:r>
+      <w:r>
+        <w:t xml:space="preserve"> </w:t>
+      </w:r>
+      <w:r>
+        <w:t xml:space="preserve">that stage a point instead of stating it.</w:t>
+      </w:r>
+    </w:p>
+    <w:bookmarkStart w:id="20" w:name="exm-staged-point"/>
+    <w:p>
+      <w:pPr>
+        <w:pStyle w:val="BodyText"/>
+      </w:pPr>
+      <w:r>
+        <w:rPr>
+          <w:b/>
+          <w:bCs/>
+        </w:rPr>
+        <w:t xml:space="preserve">Example 3 (A staged point)</w:t>
       </w:r>
       <w:r>
         <w:t xml:space="preserve"> </w:t>
@@ -2013,7 +2259,7 @@
         <w:t xml:space="preserve">The second version states the claim once.</w:t>
       </w:r>
     </w:p>
-    <w:bookmarkEnd w:id="17"/>
+    <w:bookmarkEnd w:id="20"/>
     <w:p>
       <w:pPr>
         <w:pStyle w:val="BodyText"/>
@@ -2274,6 +2520,118 @@
           <w:b/>
           <w:bCs/>
         </w:rPr>
+        <w:t xml:space="preserve">The announced claim.</w:t>
+      </w:r>
+      <w:r>
+        <w:t xml:space="preserve"> </w:t>
+      </w:r>
+      <w:r>
+        <w:t xml:space="preserve">“It is what makes … valid”</w:t>
+      </w:r>
+      <w:r>
+        <w:t xml:space="preserve">,</w:t>
+      </w:r>
+      <w:r>
+        <w:t xml:space="preserve"> </w:t>
+      </w:r>
+      <w:r>
+        <w:t xml:space="preserve">“That is what …”</w:t>
+      </w:r>
+      <w:r>
+        <w:t xml:space="preserve">,</w:t>
+      </w:r>
+      <w:r>
+        <w:t xml:space="preserve"> </w:t>
+      </w:r>
+      <w:r>
+        <w:t xml:space="preserve">“This is what …”</w:t>
+      </w:r>
+      <w:r>
+        <w:t xml:space="preserve">, and</w:t>
+      </w:r>
+      <w:r>
+        <w:t xml:space="preserve"> </w:t>
+      </w:r>
+      <w:r>
+        <w:t xml:space="preserve">“What the standing grant removes is the need to ask”</w:t>
+      </w:r>
+      <w:r>
+        <w:t xml:space="preserve">.</w:t>
+      </w:r>
+      <w:r>
+        <w:t xml:space="preserve"> </w:t>
+      </w:r>
+      <w:r>
+        <w:t xml:space="preserve">The sentence points at its own claim before making it.</w:t>
+      </w:r>
+      <w:r>
+        <w:t xml:space="preserve"> </w:t>
+      </w:r>
+      <w:r>
+        <w:t xml:space="preserve">Make the claim directly:</w:t>
+      </w:r>
+      <w:r>
+        <w:t xml:space="preserve"> </w:t>
+      </w:r>
+      <w:r>
+        <w:t xml:space="preserve">“It is what makes sums over countably infinite partitions valid”</w:t>
+      </w:r>
+      <w:r>
+        <w:t xml:space="preserve"> </w:t>
+      </w:r>
+      <w:r>
+        <w:t xml:space="preserve">becomes</w:t>
+      </w:r>
+      <w:r>
+        <w:t xml:space="preserve"> </w:t>
+      </w:r>
+      <w:r>
+        <w:t xml:space="preserve">“It makes sums over countably infinite partitions valid”</w:t>
+      </w:r>
+      <w:r>
+        <w:t xml:space="preserve">,</w:t>
+      </w:r>
+      <w:r>
+        <w:t xml:space="preserve"> </w:t>
+      </w:r>
+      <w:r>
+        <w:t xml:space="preserve">and</w:t>
+      </w:r>
+      <w:r>
+        <w:t xml:space="preserve"> </w:t>
+      </w:r>
+      <w:r>
+        <w:t xml:space="preserve">“What the standing grant removes is the need to ask”</w:t>
+      </w:r>
+      <w:r>
+        <w:t xml:space="preserve"> </w:t>
+      </w:r>
+      <w:r>
+        <w:t xml:space="preserve">becomes</w:t>
+      </w:r>
+      <w:r>
+        <w:t xml:space="preserve"> </w:t>
+      </w:r>
+      <w:r>
+        <w:t xml:space="preserve">“The standing grant removes the need to ask”</w:t>
+      </w:r>
+      <w:r>
+        <w:t xml:space="preserve">.</w:t>
+      </w:r>
+    </w:p>
+    <w:p>
+      <w:pPr>
+        <w:pStyle w:val="Compact"/>
+        <w:numPr>
+          <w:ilvl w:val="0"/>
+          <w:numId w:val="1006"/>
+        </w:numPr>
+      </w:pPr>
+      <w:r>
+        <w:rPr>
+          <w:b/>
+          <w:bCs/>
+        </w:rPr>
         <w:t xml:space="preserve">The reframe.</w:t>
       </w:r>
       <w:r>
@@ -2834,7 +3192,7 @@
       <w:r>
         <w:t xml:space="preserve">(</w:t>
       </w:r>
-      <w:hyperlink r:id="rId18">
+      <w:hyperlink r:id="rId21">
         <w:r>
           <w:rPr>
             <w:rStyle w:val="Hyperlink"/>
@@ -2869,7 +3227,7 @@
       <w:r>
         <w:t xml:space="preserve">(</w:t>
       </w:r>
-      <w:hyperlink r:id="rId19">
+      <w:hyperlink r:id="rId22">
         <w:r>
           <w:rPr>
             <w:rStyle w:val="Hyperlink"/>
@@ -2898,7 +3256,7 @@
       <w:r>
         <w:t xml:space="preserve">(</w:t>
       </w:r>
-      <w:hyperlink r:id="rId20">
+      <w:hyperlink r:id="rId23">
         <w:r>
           <w:rPr>
             <w:rStyle w:val="Hyperlink"/>
@@ -2927,7 +3285,7 @@
       <w:r>
         <w:t xml:space="preserve">(</w:t>
       </w:r>
-      <w:hyperlink r:id="rId21">
+      <w:hyperlink r:id="rId24">
         <w:r>
           <w:rPr>
             <w:rStyle w:val="Hyperlink"/>
@@ -2939,14 +3297,14 @@
         <w:t xml:space="preserve">).</w:t>
       </w:r>
     </w:p>
-    <w:bookmarkEnd w:id="22"/>
-    <w:bookmarkStart w:id="23" w:name="formatting-habits"/>
+    <w:bookmarkEnd w:id="25"/>
+    <w:bookmarkStart w:id="26" w:name="formatting-habits"/>
     <w:p>
       <w:pPr>
         <w:pStyle w:val="Heading2"/>
       </w:pPr>
       <w:r>
-        <w:t xml:space="preserve">4 Formatting habits</w:t>
+        <w:t xml:space="preserve">5 Formatting habits</w:t>
       </w:r>
     </w:p>
     <w:p>
@@ -3102,14 +3460,14 @@
         <w:t xml:space="preserve">ideas.</w:t>
       </w:r>
     </w:p>
-    <w:bookmarkEnd w:id="23"/>
-    <w:bookmarkStart w:id="25" w:name="tone"/>
+    <w:bookmarkEnd w:id="26"/>
+    <w:bookmarkStart w:id="28" w:name="tone"/>
     <w:p>
       <w:pPr>
         <w:pStyle w:val="Heading2"/>
       </w:pPr>
       <w:r>
-        <w:t xml:space="preserve">5 Tone</w:t>
+        <w:t xml:space="preserve">6 Tone</w:t>
       </w:r>
     </w:p>
     <w:p>
@@ -3275,7 +3633,7 @@
       <w:r>
         <w:t xml:space="preserve"> </w:t>
       </w:r>
-      <w:hyperlink r:id="rId24">
+      <w:hyperlink r:id="rId27">
         <w:r>
           <w:rPr>
             <w:rStyle w:val="Hyperlink"/>
@@ -3328,7 +3686,7 @@
         <w:t xml:space="preserve">not prose that has been sanded smooth.</w:t>
       </w:r>
     </w:p>
-    <w:bookmarkEnd w:id="25"/>
+    <w:bookmarkEnd w:id="28"/>
     <w:sectPr>
       <w:footnotePr>
         <w:numRestart w:val="eachSect"/>

</xml_diff>